<commit_message>
Sync CV file to public directory
Co-Authored-By: Claude Haiku 4.5 <noreply@anthropic.com>
</commit_message>
<xml_diff>
--- a/public/Yigal-Krigel-CV.docx
+++ b/public/Yigal-Krigel-CV.docx
@@ -193,7 +193,7 @@
           <w:szCs w:val="20"/>
           <w:u w:val="single"/>
         </w:rPr>
-        <w:t xml:space="preserve">FULL STACK </w:t>
+        <w:t>Software Developer;</w:t>
       </w:r>
       <w:r>
         <w:rPr>
@@ -201,9 +201,8 @@
           <w:color w:val="000000"/>
           <w:sz w:val="20"/>
           <w:szCs w:val="20"/>
-          <w:u w:val="single"/>
-        </w:rPr>
-        <w:t>–</w:t>
+        </w:rPr>
+        <w:t xml:space="preserve"> Experienced in developing scalable SaaS products for B2B &amp; B2C clients in startup companies; </w:t>
       </w:r>
       <w:r>
         <w:rPr>
@@ -213,7 +212,7 @@
           <w:szCs w:val="20"/>
           <w:u w:val="single"/>
         </w:rPr>
-        <w:t xml:space="preserve"> AI</w:t>
+        <w:t>Holding a security clearance</w:t>
       </w:r>
       <w:r>
         <w:rPr>
@@ -221,18 +220,8 @@
           <w:color w:val="000000"/>
           <w:sz w:val="20"/>
           <w:szCs w:val="20"/>
-          <w:u w:val="single"/>
-        </w:rPr>
-        <w:t>;</w:t>
-      </w:r>
-      <w:r>
-        <w:rPr>
-          <w:b/>
-          <w:color w:val="000000"/>
-          <w:sz w:val="20"/>
-          <w:szCs w:val="20"/>
-        </w:rPr>
-        <w:t xml:space="preserve"> Experienced in developing scalable SaaS products for B2B &amp; B2C clients in startup companies </w:t>
+        </w:rPr>
+        <w:t xml:space="preserve"> </w:t>
       </w:r>
     </w:p>
     <w:p>
@@ -264,7 +253,7 @@
           <w:sz w:val="20"/>
           <w:szCs w:val="20"/>
         </w:rPr>
-        <w:t>Experience developing software using React and NodeJS</w:t>
+        <w:t>Developing microservices based applications using MySQL &amp; NoSQL DB by practical coding projects</w:t>
       </w:r>
     </w:p>
     <w:p>
@@ -296,25 +285,7 @@
           <w:sz w:val="20"/>
           <w:szCs w:val="20"/>
         </w:rPr>
-        <w:t>Excellent programming skills</w:t>
-      </w:r>
-      <w:r>
-        <w:rPr>
-          <w:b/>
-          <w:color w:val="000000"/>
-          <w:sz w:val="20"/>
-          <w:szCs w:val="20"/>
-        </w:rPr>
-        <w:t xml:space="preserve"> and a</w:t>
-      </w:r>
-      <w:r>
-        <w:rPr>
-          <w:b/>
-          <w:color w:val="000000"/>
-          <w:sz w:val="20"/>
-          <w:szCs w:val="20"/>
-        </w:rPr>
-        <w:t>bility to learn complex concepts in a fast pace environment</w:t>
+        <w:t>Experienced in developing solutions and ensuring system reliability across development lifecycles</w:t>
       </w:r>
     </w:p>
     <w:p>
@@ -346,7 +317,7 @@
           <w:sz w:val="20"/>
           <w:szCs w:val="20"/>
         </w:rPr>
-        <w:t>A teammate with a can-do attitude, high energy and excellent interpersonal skills</w:t>
+        <w:t>Analytical mindset, strong problem-solving skills, skilled in delivering high scalable products</w:t>
       </w:r>
     </w:p>
     <w:p>
@@ -378,250 +349,6 @@
           <w:sz w:val="20"/>
           <w:szCs w:val="20"/>
         </w:rPr>
-        <w:t>H</w:t>
-      </w:r>
-      <w:r>
-        <w:rPr>
-          <w:b/>
-          <w:color w:val="000000"/>
-          <w:sz w:val="20"/>
-          <w:szCs w:val="20"/>
-        </w:rPr>
-        <w:t>ands-on experience with LLM serving frameworks</w:t>
-      </w:r>
-    </w:p>
-    <w:p>
-      <w:pPr>
-        <w:numPr>
-          <w:ilvl w:val="0"/>
-          <w:numId w:val="4"/>
-        </w:numPr>
-        <w:pBdr>
-          <w:top w:val="nil"/>
-          <w:left w:val="nil"/>
-          <w:bottom w:val="nil"/>
-          <w:right w:val="nil"/>
-          <w:between w:val="nil"/>
-        </w:pBdr>
-        <w:spacing w:after="0" w:line="324" w:lineRule="auto"/>
-        <w:ind w:left="284" w:hanging="284"/>
-        <w:rPr>
-          <w:b/>
-          <w:color w:val="000000"/>
-          <w:sz w:val="20"/>
-          <w:szCs w:val="20"/>
-        </w:rPr>
-      </w:pPr>
-      <w:r>
-        <w:rPr>
-          <w:b/>
-          <w:color w:val="000000"/>
-          <w:sz w:val="20"/>
-          <w:szCs w:val="20"/>
-        </w:rPr>
-        <w:t xml:space="preserve">Experience with open-source projects – </w:t>
-      </w:r>
-      <w:hyperlink r:id="rId7" w:history="1">
-        <w:r>
-          <w:rPr>
-            <w:rStyle w:val="Hyperlink"/>
-            <w:b/>
-            <w:sz w:val="20"/>
-            <w:szCs w:val="20"/>
-          </w:rPr>
-          <w:t>RAG Assessment</w:t>
-        </w:r>
-      </w:hyperlink>
-      <w:r>
-        <w:rPr>
-          <w:b/>
-          <w:color w:val="000000"/>
-          <w:sz w:val="20"/>
-          <w:szCs w:val="20"/>
-        </w:rPr>
-        <w:t xml:space="preserve">; </w:t>
-      </w:r>
-      <w:hyperlink r:id="rId8" w:history="1">
-        <w:r>
-          <w:rPr>
-            <w:rStyle w:val="Hyperlink"/>
-            <w:b/>
-            <w:sz w:val="20"/>
-            <w:szCs w:val="20"/>
-          </w:rPr>
-          <w:t>Logs Agent</w:t>
-        </w:r>
-      </w:hyperlink>
-      <w:r>
-        <w:rPr>
-          <w:b/>
-          <w:color w:val="000000"/>
-          <w:sz w:val="20"/>
-          <w:szCs w:val="20"/>
-        </w:rPr>
-        <w:t xml:space="preserve">; </w:t>
-      </w:r>
-      <w:hyperlink r:id="rId9" w:history="1">
-        <w:r>
-          <w:rPr>
-            <w:rStyle w:val="Hyperlink"/>
-            <w:b/>
-            <w:sz w:val="20"/>
-            <w:szCs w:val="20"/>
-          </w:rPr>
-          <w:t>M</w:t>
-        </w:r>
-        <w:proofErr w:type="spellStart"/>
-        <w:r>
-          <w:rPr>
-            <w:rStyle w:val="Hyperlink"/>
-            <w:b/>
-            <w:bCs/>
-            <w:sz w:val="20"/>
-            <w:szCs w:val="20"/>
-            <w:lang w:val="en-IL"/>
-          </w:rPr>
-          <w:t>inimal</w:t>
-        </w:r>
-        <w:proofErr w:type="spellEnd"/>
-        <w:r>
-          <w:rPr>
-            <w:rStyle w:val="Hyperlink"/>
-            <w:b/>
-            <w:bCs/>
-            <w:sz w:val="20"/>
-            <w:szCs w:val="20"/>
-            <w:lang w:val="en-IL"/>
-          </w:rPr>
-          <w:t xml:space="preserve"> agent</w:t>
-        </w:r>
-      </w:hyperlink>
-    </w:p>
-    <w:p>
-      <w:pPr>
-        <w:numPr>
-          <w:ilvl w:val="0"/>
-          <w:numId w:val="4"/>
-        </w:numPr>
-        <w:pBdr>
-          <w:top w:val="nil"/>
-          <w:left w:val="nil"/>
-          <w:bottom w:val="nil"/>
-          <w:right w:val="nil"/>
-          <w:between w:val="nil"/>
-        </w:pBdr>
-        <w:spacing w:after="0" w:line="324" w:lineRule="auto"/>
-        <w:ind w:left="284" w:hanging="284"/>
-        <w:rPr>
-          <w:b/>
-          <w:color w:val="000000"/>
-          <w:sz w:val="20"/>
-          <w:szCs w:val="20"/>
-        </w:rPr>
-      </w:pPr>
-      <w:r>
-        <w:rPr>
-          <w:b/>
-          <w:color w:val="000000"/>
-          <w:sz w:val="20"/>
-          <w:szCs w:val="20"/>
-        </w:rPr>
-        <w:t>Developing microservices based applications using MySQL &amp; NoSQL DB by practical coding projects</w:t>
-      </w:r>
-    </w:p>
-    <w:p>
-      <w:pPr>
-        <w:numPr>
-          <w:ilvl w:val="0"/>
-          <w:numId w:val="4"/>
-        </w:numPr>
-        <w:pBdr>
-          <w:top w:val="nil"/>
-          <w:left w:val="nil"/>
-          <w:bottom w:val="nil"/>
-          <w:right w:val="nil"/>
-          <w:between w:val="nil"/>
-        </w:pBdr>
-        <w:spacing w:after="0" w:line="324" w:lineRule="auto"/>
-        <w:ind w:left="284" w:hanging="284"/>
-        <w:rPr>
-          <w:b/>
-          <w:color w:val="000000"/>
-          <w:sz w:val="20"/>
-          <w:szCs w:val="20"/>
-        </w:rPr>
-      </w:pPr>
-      <w:r>
-        <w:rPr>
-          <w:b/>
-          <w:color w:val="000000"/>
-          <w:sz w:val="20"/>
-          <w:szCs w:val="20"/>
-        </w:rPr>
-        <w:t>Experienced in developing solutions and ensuring system reliability across development lifecycles</w:t>
-      </w:r>
-    </w:p>
-    <w:p>
-      <w:pPr>
-        <w:numPr>
-          <w:ilvl w:val="0"/>
-          <w:numId w:val="4"/>
-        </w:numPr>
-        <w:pBdr>
-          <w:top w:val="nil"/>
-          <w:left w:val="nil"/>
-          <w:bottom w:val="nil"/>
-          <w:right w:val="nil"/>
-          <w:between w:val="nil"/>
-        </w:pBdr>
-        <w:spacing w:after="0" w:line="324" w:lineRule="auto"/>
-        <w:ind w:left="284" w:hanging="284"/>
-        <w:rPr>
-          <w:b/>
-          <w:color w:val="000000"/>
-          <w:sz w:val="20"/>
-          <w:szCs w:val="20"/>
-        </w:rPr>
-      </w:pPr>
-      <w:r>
-        <w:rPr>
-          <w:b/>
-          <w:color w:val="000000"/>
-          <w:sz w:val="20"/>
-          <w:szCs w:val="20"/>
-        </w:rPr>
-        <w:t>Analytical mindset, strong problem-solving skills, skilled in delivering high scalable products</w:t>
-      </w:r>
-    </w:p>
-    <w:p>
-      <w:pPr>
-        <w:numPr>
-          <w:ilvl w:val="0"/>
-          <w:numId w:val="4"/>
-        </w:numPr>
-        <w:pBdr>
-          <w:top w:val="nil"/>
-          <w:left w:val="nil"/>
-          <w:bottom w:val="nil"/>
-          <w:right w:val="nil"/>
-          <w:between w:val="nil"/>
-        </w:pBdr>
-        <w:spacing w:after="0" w:line="324" w:lineRule="auto"/>
-        <w:ind w:left="284" w:hanging="284"/>
-        <w:rPr>
-          <w:b/>
-          <w:color w:val="000000"/>
-          <w:sz w:val="20"/>
-          <w:szCs w:val="20"/>
-        </w:rPr>
-      </w:pPr>
-      <w:r>
-        <w:rPr>
-          <w:b/>
-          <w:color w:val="000000"/>
-          <w:sz w:val="20"/>
-          <w:szCs w:val="20"/>
-        </w:rPr>
         <w:t xml:space="preserve">Self-driven with a "can-do" approach, highly motivated with excellent communication skills </w:t>
       </w:r>
     </w:p>
@@ -684,49 +411,11 @@
       <w:r>
         <w:rPr>
           <w:b/>
-          <w:color w:val="000000"/>
-          <w:sz w:val="20"/>
-          <w:szCs w:val="20"/>
-          <w:u w:val="single"/>
-        </w:rPr>
-        <w:t xml:space="preserve">FULL STACK </w:t>
-      </w:r>
-      <w:r>
-        <w:rPr>
-          <w:b/>
-          <w:sz w:val="21"/>
-          <w:szCs w:val="21"/>
-          <w:u w:val="single"/>
-        </w:rPr>
-        <w:t xml:space="preserve">Software </w:t>
-      </w:r>
-      <w:r>
-        <w:rPr>
-          <w:b/>
-          <w:color w:val="000000"/>
-          <w:sz w:val="20"/>
-          <w:szCs w:val="20"/>
-          <w:u w:val="single"/>
-        </w:rPr>
-        <w:t>Engineer</w:t>
-      </w:r>
-      <w:r>
-        <w:rPr>
-          <w:b/>
-          <w:sz w:val="21"/>
-          <w:szCs w:val="21"/>
-          <w:u w:val="single"/>
-        </w:rPr>
-        <w:t xml:space="preserve"> </w:t>
-      </w:r>
-      <w:r>
-        <w:rPr>
-          <w:b/>
-          <w:sz w:val="21"/>
-          <w:szCs w:val="21"/>
-          <w:u w:val="single"/>
-        </w:rPr>
-        <w:t>| Rafael Advanced Defense Systems</w:t>
+          <w:sz w:val="21"/>
+          <w:szCs w:val="21"/>
+          <w:u w:val="single"/>
+        </w:rPr>
+        <w:t>Software Developer | Rafael Advanced Defense Systems</w:t>
       </w:r>
     </w:p>
     <w:p>
@@ -786,23 +475,7 @@
           <w:sz w:val="21"/>
           <w:szCs w:val="21"/>
         </w:rPr>
-        <w:t xml:space="preserve">Developing, debugging &amp; maintaining test software using </w:t>
-      </w:r>
-      <w:r>
-        <w:rPr>
-          <w:color w:val="000000"/>
-          <w:sz w:val="21"/>
-          <w:szCs w:val="21"/>
-        </w:rPr>
-        <w:t xml:space="preserve">React, NodeJS, </w:t>
-      </w:r>
-      <w:r>
-        <w:rPr>
-          <w:color w:val="000000"/>
-          <w:sz w:val="21"/>
-          <w:szCs w:val="21"/>
-        </w:rPr>
-        <w:t>and C# in Azure DevOps environment</w:t>
+        <w:t>Developing, debugging &amp; maintaining test software using ATEasy and C# in Azure DevOps environment</w:t>
       </w:r>
     </w:p>
     <w:p>
@@ -1062,12 +735,11 @@
       <w:r>
         <w:rPr>
           <w:b/>
-          <w:color w:val="000000"/>
-          <w:sz w:val="20"/>
-          <w:szCs w:val="20"/>
-          <w:u w:val="single"/>
-        </w:rPr>
-        <w:t xml:space="preserve">FULL STACK </w:t>
+          <w:sz w:val="21"/>
+          <w:szCs w:val="21"/>
+          <w:u w:val="single"/>
+        </w:rPr>
+        <w:t xml:space="preserve">Software </w:t>
       </w:r>
       <w:r>
         <w:rPr>
@@ -2070,7 +1742,6 @@
           <w:szCs w:val="21"/>
           <w:u w:val="single"/>
         </w:rPr>
-        <w:lastRenderedPageBreak/>
         <w:t>Tools &amp; Technologies:</w:t>
       </w:r>
     </w:p>
@@ -2330,6 +2001,7 @@
           <w:sz w:val="21"/>
           <w:szCs w:val="21"/>
         </w:rPr>
+        <w:lastRenderedPageBreak/>
         <w:t>Docker | Postman Azure DevOps VMware</w:t>
       </w:r>
     </w:p>
@@ -3477,29 +3149,6 @@
       <w:szCs w:val="24"/>
     </w:rPr>
   </w:style>
-  <w:style w:type="character" w:styleId="Hyperlink">
-    <w:name w:val="Hyperlink"/>
-    <w:basedOn w:val="DefaultParagraphFont"/>
-    <w:uiPriority w:val="99"/>
-    <w:unhideWhenUsed/>
-    <w:rsid w:val="00044347"/>
-    <w:rPr>
-      <w:color w:val="0000FF" w:themeColor="hyperlink"/>
-      <w:u w:val="single"/>
-    </w:rPr>
-  </w:style>
-  <w:style w:type="character" w:styleId="UnresolvedMention">
-    <w:name w:val="Unresolved Mention"/>
-    <w:basedOn w:val="DefaultParagraphFont"/>
-    <w:uiPriority w:val="99"/>
-    <w:semiHidden/>
-    <w:unhideWhenUsed/>
-    <w:rsid w:val="00044347"/>
-    <w:rPr>
-      <w:color w:val="605E5C"/>
-      <w:shd w:val="clear" w:color="auto" w:fill="E1DFDD"/>
-    </w:rPr>
-  </w:style>
 </w:styles>
 </file>
 

</xml_diff>